<commit_message>
Tanda Terima template: compact one-page layout with taller signature space
- One-paragraph signature cell (odd numbers left, even tabbed right) so
  each worker row is a single line instead of two
- 9 pt table text, tighter padding, 1 cm top/bottom margins
- ~0.78 cm worker rows and six blank lines above the signature names
- 20 workers fit on one A4 page (checked via LibreOffice render)

Co-Authored-By: Claude Opus 5.5 <noreply@anthropic.com>
</commit_message>
<xml_diff>
--- a/development/templates/Tanda_Terima_Template.docx
+++ b/development/templates/Tanda_Terima_Template.docx
@@ -4,23 +4,7 @@
   <w:body>
     <w:p>
       <w:pPr>
-        <w:spacing w:before="0" w:after="0"/>
-        <w:jc w:val="center"/>
-      </w:pPr>
-      <w:r>
-        <w:rPr>
-          <w:rFonts w:ascii="Arial" w:cs="Arial" w:eastAsia="Arial" w:hAnsi="Arial"/>
-          <w:b/>
-          <w:bCs/>
-          <w:sz w:val="26"/>
-          <w:szCs w:val="26"/>
-        </w:rPr>
-        <w:t xml:space="preserve">{judul}</w:t>
-      </w:r>
-    </w:p>
-    <w:p>
-      <w:pPr>
-        <w:spacing w:before="0" w:after="160"/>
+        <w:spacing w:before="0" w:after="0" w:line="240"/>
         <w:jc w:val="center"/>
       </w:pPr>
       <w:r>
@@ -31,12 +15,28 @@
           <w:sz w:val="24"/>
           <w:szCs w:val="24"/>
         </w:rPr>
+        <w:t xml:space="preserve">{judul}</w:t>
+      </w:r>
+    </w:p>
+    <w:p>
+      <w:pPr>
+        <w:spacing w:before="0" w:after="0" w:line="240"/>
+        <w:jc w:val="center"/>
+      </w:pPr>
+      <w:r>
+        <w:rPr>
+          <w:rFonts w:ascii="Arial" w:cs="Arial" w:eastAsia="Arial" w:hAnsi="Arial"/>
+          <w:b/>
+          <w:bCs/>
+          <w:sz w:val="22"/>
+          <w:szCs w:val="22"/>
+        </w:rPr>
         <w:t xml:space="preserve">{nama_gudang}</w:t>
       </w:r>
     </w:p>
     <w:p>
       <w:pPr>
-        <w:spacing w:before="0" w:after="0"/>
+        <w:spacing w:before="0" w:after="0" w:line="240"/>
         <w:jc w:val="center"/>
       </w:pPr>
       <w:r>
@@ -52,7 +52,7 @@
     </w:p>
     <w:p>
       <w:pPr>
-        <w:spacing w:before="0" w:after="200"/>
+        <w:spacing w:before="0" w:after="120" w:line="240"/>
         <w:jc w:val="center"/>
       </w:pPr>
       <w:r>
@@ -66,7 +66,7 @@
     </w:p>
     <w:tbl>
       <w:tblPr>
-        <w:tblW w:type="dxa" w:w="9638"/>
+        <w:tblW w:type="dxa" w:w="10206"/>
         <w:tblBorders>
           <w:top w:val="single" w:color="auto" w:sz="4"/>
           <w:left w:val="single" w:color="auto" w:sz="4"/>
@@ -77,14 +77,17 @@
         </w:tblBorders>
       </w:tblPr>
       <w:tblGrid>
-        <w:gridCol w:w="3638"/>
+        <w:gridCol w:w="4206"/>
         <w:gridCol w:w="3000"/>
         <w:gridCol w:w="3000"/>
       </w:tblGrid>
       <w:tr>
-        <w:tc>
-          <w:tcPr>
-            <w:tcW w:type="dxa" w:w="3638"/>
+        <w:trPr>
+          <w:cantSplit/>
+        </w:trPr>
+        <w:tc>
+          <w:tcPr>
+            <w:tcW w:type="dxa" w:w="4206"/>
             <w:tcBorders>
               <w:top w:val="single" w:color="000000" w:sz="4"/>
               <w:left w:val="single" w:color="000000" w:sz="4"/>
@@ -93,23 +96,23 @@
             </w:tcBorders>
             <w:shd w:fill="E7E6E6" w:color="auto" w:val="clear"/>
             <w:tcMar>
-              <w:top w:type="dxa" w:w="60"/>
-              <w:left w:type="dxa" w:w="100"/>
-              <w:bottom w:type="dxa" w:w="60"/>
-              <w:right w:type="dxa" w:w="100"/>
-            </w:tcMar>
-            <w:vAlign w:val="center"/>
-          </w:tcPr>
-          <w:p>
-            <w:pPr>
-              <w:spacing w:before="0" w:after="0"/>
+              <w:top w:type="dxa" w:w="20"/>
+              <w:left w:type="dxa" w:w="80"/>
+              <w:bottom w:type="dxa" w:w="20"/>
+              <w:right w:type="dxa" w:w="80"/>
+            </w:tcMar>
+            <w:vAlign w:val="center"/>
+          </w:tcPr>
+          <w:p>
+            <w:pPr>
+              <w:spacing w:before="0" w:after="0" w:line="240"/>
               <w:jc w:val="left"/>
             </w:pPr>
             <w:r>
               <w:rPr>
                 <w:rFonts w:ascii="Arial" w:cs="Arial" w:eastAsia="Arial" w:hAnsi="Arial"/>
-                <w:sz w:val="20"/>
-                <w:szCs w:val="20"/>
+                <w:sz w:val="18"/>
+                <w:szCs w:val="18"/>
               </w:rPr>
               <w:t xml:space="preserve"/>
             </w:r>
@@ -126,16 +129,16 @@
             </w:tcBorders>
             <w:shd w:fill="E7E6E6" w:color="auto" w:val="clear"/>
             <w:tcMar>
-              <w:top w:type="dxa" w:w="60"/>
-              <w:left w:type="dxa" w:w="100"/>
-              <w:bottom w:type="dxa" w:w="60"/>
-              <w:right w:type="dxa" w:w="100"/>
-            </w:tcMar>
-            <w:vAlign w:val="center"/>
-          </w:tcPr>
-          <w:p>
-            <w:pPr>
-              <w:spacing w:before="0" w:after="0"/>
+              <w:top w:type="dxa" w:w="20"/>
+              <w:left w:type="dxa" w:w="80"/>
+              <w:bottom w:type="dxa" w:w="20"/>
+              <w:right w:type="dxa" w:w="80"/>
+            </w:tcMar>
+            <w:vAlign w:val="center"/>
+          </w:tcPr>
+          <w:p>
+            <w:pPr>
+              <w:spacing w:before="0" w:after="0" w:line="240"/>
               <w:jc w:val="center"/>
             </w:pPr>
             <w:r>
@@ -143,8 +146,8 @@
                 <w:rFonts w:ascii="Arial" w:cs="Arial" w:eastAsia="Arial" w:hAnsi="Arial"/>
                 <w:b/>
                 <w:bCs/>
-                <w:sz w:val="20"/>
-                <w:szCs w:val="20"/>
+                <w:sz w:val="18"/>
+                <w:szCs w:val="18"/>
               </w:rPr>
               <w:t xml:space="preserve">Keluar</w:t>
             </w:r>
@@ -161,16 +164,16 @@
             </w:tcBorders>
             <w:shd w:fill="E7E6E6" w:color="auto" w:val="clear"/>
             <w:tcMar>
-              <w:top w:type="dxa" w:w="60"/>
-              <w:left w:type="dxa" w:w="100"/>
-              <w:bottom w:type="dxa" w:w="60"/>
-              <w:right w:type="dxa" w:w="100"/>
-            </w:tcMar>
-            <w:vAlign w:val="center"/>
-          </w:tcPr>
-          <w:p>
-            <w:pPr>
-              <w:spacing w:before="0" w:after="0"/>
+              <w:top w:type="dxa" w:w="20"/>
+              <w:left w:type="dxa" w:w="80"/>
+              <w:bottom w:type="dxa" w:w="20"/>
+              <w:right w:type="dxa" w:w="80"/>
+            </w:tcMar>
+            <w:vAlign w:val="center"/>
+          </w:tcPr>
+          <w:p>
+            <w:pPr>
+              <w:spacing w:before="0" w:after="0" w:line="240"/>
               <w:jc w:val="center"/>
             </w:pPr>
             <w:r>
@@ -178,8 +181,8 @@
                 <w:rFonts w:ascii="Arial" w:cs="Arial" w:eastAsia="Arial" w:hAnsi="Arial"/>
                 <w:b/>
                 <w:bCs/>
-                <w:sz w:val="20"/>
-                <w:szCs w:val="20"/>
+                <w:sz w:val="18"/>
+                <w:szCs w:val="18"/>
               </w:rPr>
               <w:t xml:space="preserve">Total</w:t>
             </w:r>
@@ -187,33 +190,36 @@
         </w:tc>
       </w:tr>
       <w:tr>
-        <w:tc>
-          <w:tcPr>
-            <w:tcW w:type="dxa" w:w="3638"/>
-            <w:tcBorders>
-              <w:top w:val="single" w:color="000000" w:sz="4"/>
-              <w:left w:val="single" w:color="000000" w:sz="4"/>
-              <w:bottom w:val="single" w:color="000000" w:sz="4"/>
-              <w:right w:val="single" w:color="000000" w:sz="4"/>
-            </w:tcBorders>
-            <w:tcMar>
-              <w:top w:type="dxa" w:w="60"/>
-              <w:left w:type="dxa" w:w="100"/>
-              <w:bottom w:type="dxa" w:w="60"/>
-              <w:right w:type="dxa" w:w="100"/>
-            </w:tcMar>
-            <w:vAlign w:val="center"/>
-          </w:tcPr>
-          <w:p>
-            <w:pPr>
-              <w:spacing w:before="0" w:after="0"/>
+        <w:trPr>
+          <w:cantSplit/>
+        </w:trPr>
+        <w:tc>
+          <w:tcPr>
+            <w:tcW w:type="dxa" w:w="4206"/>
+            <w:tcBorders>
+              <w:top w:val="single" w:color="000000" w:sz="4"/>
+              <w:left w:val="single" w:color="000000" w:sz="4"/>
+              <w:bottom w:val="single" w:color="000000" w:sz="4"/>
+              <w:right w:val="single" w:color="000000" w:sz="4"/>
+            </w:tcBorders>
+            <w:tcMar>
+              <w:top w:type="dxa" w:w="20"/>
+              <w:left w:type="dxa" w:w="80"/>
+              <w:bottom w:type="dxa" w:w="20"/>
+              <w:right w:type="dxa" w:w="80"/>
+            </w:tcMar>
+            <w:vAlign w:val="center"/>
+          </w:tcPr>
+          <w:p>
+            <w:pPr>
+              <w:spacing w:before="0" w:after="0" w:line="240"/>
               <w:jc w:val="left"/>
             </w:pPr>
             <w:r>
               <w:rPr>
                 <w:rFonts w:ascii="Arial" w:cs="Arial" w:eastAsia="Arial" w:hAnsi="Arial"/>
-                <w:sz w:val="20"/>
-                <w:szCs w:val="20"/>
+                <w:sz w:val="18"/>
+                <w:szCs w:val="18"/>
               </w:rPr>
               <w:t xml:space="preserve">Tonase (Kg)</w:t>
             </w:r>
@@ -229,23 +235,23 @@
               <w:right w:val="single" w:color="000000" w:sz="4"/>
             </w:tcBorders>
             <w:tcMar>
-              <w:top w:type="dxa" w:w="60"/>
-              <w:left w:type="dxa" w:w="100"/>
-              <w:bottom w:type="dxa" w:w="60"/>
-              <w:right w:type="dxa" w:w="100"/>
-            </w:tcMar>
-            <w:vAlign w:val="center"/>
-          </w:tcPr>
-          <w:p>
-            <w:pPr>
-              <w:spacing w:before="0" w:after="0"/>
+              <w:top w:type="dxa" w:w="20"/>
+              <w:left w:type="dxa" w:w="80"/>
+              <w:bottom w:type="dxa" w:w="20"/>
+              <w:right w:type="dxa" w:w="80"/>
+            </w:tcMar>
+            <w:vAlign w:val="center"/>
+          </w:tcPr>
+          <w:p>
+            <w:pPr>
+              <w:spacing w:before="0" w:after="0" w:line="240"/>
               <w:jc w:val="right"/>
             </w:pPr>
             <w:r>
               <w:rPr>
                 <w:rFonts w:ascii="Arial" w:cs="Arial" w:eastAsia="Arial" w:hAnsi="Arial"/>
-                <w:sz w:val="20"/>
-                <w:szCs w:val="20"/>
+                <w:sz w:val="18"/>
+                <w:szCs w:val="18"/>
               </w:rPr>
               <w:t xml:space="preserve">{tonase}</w:t>
             </w:r>
@@ -261,23 +267,23 @@
               <w:right w:val="single" w:color="000000" w:sz="4"/>
             </w:tcBorders>
             <w:tcMar>
-              <w:top w:type="dxa" w:w="60"/>
-              <w:left w:type="dxa" w:w="100"/>
-              <w:bottom w:type="dxa" w:w="60"/>
-              <w:right w:type="dxa" w:w="100"/>
-            </w:tcMar>
-            <w:vAlign w:val="center"/>
-          </w:tcPr>
-          <w:p>
-            <w:pPr>
-              <w:spacing w:before="0" w:after="0"/>
+              <w:top w:type="dxa" w:w="20"/>
+              <w:left w:type="dxa" w:w="80"/>
+              <w:bottom w:type="dxa" w:w="20"/>
+              <w:right w:type="dxa" w:w="80"/>
+            </w:tcMar>
+            <w:vAlign w:val="center"/>
+          </w:tcPr>
+          <w:p>
+            <w:pPr>
+              <w:spacing w:before="0" w:after="0" w:line="240"/>
               <w:jc w:val="right"/>
             </w:pPr>
             <w:r>
               <w:rPr>
                 <w:rFonts w:ascii="Arial" w:cs="Arial" w:eastAsia="Arial" w:hAnsi="Arial"/>
-                <w:sz w:val="20"/>
-                <w:szCs w:val="20"/>
+                <w:sz w:val="18"/>
+                <w:szCs w:val="18"/>
               </w:rPr>
               <w:t xml:space="preserve">{tonase}</w:t>
             </w:r>
@@ -285,33 +291,36 @@
         </w:tc>
       </w:tr>
       <w:tr>
-        <w:tc>
-          <w:tcPr>
-            <w:tcW w:type="dxa" w:w="3638"/>
-            <w:tcBorders>
-              <w:top w:val="single" w:color="000000" w:sz="4"/>
-              <w:left w:val="single" w:color="000000" w:sz="4"/>
-              <w:bottom w:val="single" w:color="000000" w:sz="4"/>
-              <w:right w:val="single" w:color="000000" w:sz="4"/>
-            </w:tcBorders>
-            <w:tcMar>
-              <w:top w:type="dxa" w:w="60"/>
-              <w:left w:type="dxa" w:w="100"/>
-              <w:bottom w:type="dxa" w:w="60"/>
-              <w:right w:type="dxa" w:w="100"/>
-            </w:tcMar>
-            <w:vAlign w:val="center"/>
-          </w:tcPr>
-          <w:p>
-            <w:pPr>
-              <w:spacing w:before="0" w:after="0"/>
+        <w:trPr>
+          <w:cantSplit/>
+        </w:trPr>
+        <w:tc>
+          <w:tcPr>
+            <w:tcW w:type="dxa" w:w="4206"/>
+            <w:tcBorders>
+              <w:top w:val="single" w:color="000000" w:sz="4"/>
+              <w:left w:val="single" w:color="000000" w:sz="4"/>
+              <w:bottom w:val="single" w:color="000000" w:sz="4"/>
+              <w:right w:val="single" w:color="000000" w:sz="4"/>
+            </w:tcBorders>
+            <w:tcMar>
+              <w:top w:type="dxa" w:w="20"/>
+              <w:left w:type="dxa" w:w="80"/>
+              <w:bottom w:type="dxa" w:w="20"/>
+              <w:right w:type="dxa" w:w="80"/>
+            </w:tcMar>
+            <w:vAlign w:val="center"/>
+          </w:tcPr>
+          <w:p>
+            <w:pPr>
+              <w:spacing w:before="0" w:after="0" w:line="240"/>
               <w:jc w:val="left"/>
             </w:pPr>
             <w:r>
               <w:rPr>
                 <w:rFonts w:ascii="Arial" w:cs="Arial" w:eastAsia="Arial" w:hAnsi="Arial"/>
-                <w:sz w:val="20"/>
-                <w:szCs w:val="20"/>
+                <w:sz w:val="18"/>
+                <w:szCs w:val="18"/>
               </w:rPr>
               <w:t xml:space="preserve">Upah per Kg (Rp)</w:t>
             </w:r>
@@ -327,23 +336,23 @@
               <w:right w:val="single" w:color="000000" w:sz="4"/>
             </w:tcBorders>
             <w:tcMar>
-              <w:top w:type="dxa" w:w="60"/>
-              <w:left w:type="dxa" w:w="100"/>
-              <w:bottom w:type="dxa" w:w="60"/>
-              <w:right w:type="dxa" w:w="100"/>
-            </w:tcMar>
-            <w:vAlign w:val="center"/>
-          </w:tcPr>
-          <w:p>
-            <w:pPr>
-              <w:spacing w:before="0" w:after="0"/>
+              <w:top w:type="dxa" w:w="20"/>
+              <w:left w:type="dxa" w:w="80"/>
+              <w:bottom w:type="dxa" w:w="20"/>
+              <w:right w:type="dxa" w:w="80"/>
+            </w:tcMar>
+            <w:vAlign w:val="center"/>
+          </w:tcPr>
+          <w:p>
+            <w:pPr>
+              <w:spacing w:before="0" w:after="0" w:line="240"/>
               <w:jc w:val="right"/>
             </w:pPr>
             <w:r>
               <w:rPr>
                 <w:rFonts w:ascii="Arial" w:cs="Arial" w:eastAsia="Arial" w:hAnsi="Arial"/>
-                <w:sz w:val="20"/>
-                <w:szCs w:val="20"/>
+                <w:sz w:val="18"/>
+                <w:szCs w:val="18"/>
               </w:rPr>
               <w:t xml:space="preserve">{upah_per_kg}</w:t>
             </w:r>
@@ -359,23 +368,23 @@
               <w:right w:val="single" w:color="000000" w:sz="4"/>
             </w:tcBorders>
             <w:tcMar>
-              <w:top w:type="dxa" w:w="60"/>
-              <w:left w:type="dxa" w:w="100"/>
-              <w:bottom w:type="dxa" w:w="60"/>
-              <w:right w:type="dxa" w:w="100"/>
-            </w:tcMar>
-            <w:vAlign w:val="center"/>
-          </w:tcPr>
-          <w:p>
-            <w:pPr>
-              <w:spacing w:before="0" w:after="0"/>
+              <w:top w:type="dxa" w:w="20"/>
+              <w:left w:type="dxa" w:w="80"/>
+              <w:bottom w:type="dxa" w:w="20"/>
+              <w:right w:type="dxa" w:w="80"/>
+            </w:tcMar>
+            <w:vAlign w:val="center"/>
+          </w:tcPr>
+          <w:p>
+            <w:pPr>
+              <w:spacing w:before="0" w:after="0" w:line="240"/>
               <w:jc w:val="left"/>
             </w:pPr>
             <w:r>
               <w:rPr>
                 <w:rFonts w:ascii="Arial" w:cs="Arial" w:eastAsia="Arial" w:hAnsi="Arial"/>
-                <w:sz w:val="20"/>
-                <w:szCs w:val="20"/>
+                <w:sz w:val="18"/>
+                <w:szCs w:val="18"/>
               </w:rPr>
               <w:t xml:space="preserve"/>
             </w:r>
@@ -383,26 +392,29 @@
         </w:tc>
       </w:tr>
       <w:tr>
-        <w:tc>
-          <w:tcPr>
-            <w:tcW w:type="dxa" w:w="3638"/>
-            <w:tcBorders>
-              <w:top w:val="single" w:color="000000" w:sz="4"/>
-              <w:left w:val="single" w:color="000000" w:sz="4"/>
-              <w:bottom w:val="single" w:color="000000" w:sz="4"/>
-              <w:right w:val="single" w:color="000000" w:sz="4"/>
-            </w:tcBorders>
-            <w:tcMar>
-              <w:top w:type="dxa" w:w="60"/>
-              <w:left w:type="dxa" w:w="100"/>
-              <w:bottom w:type="dxa" w:w="60"/>
-              <w:right w:type="dxa" w:w="100"/>
-            </w:tcMar>
-            <w:vAlign w:val="center"/>
-          </w:tcPr>
-          <w:p>
-            <w:pPr>
-              <w:spacing w:before="0" w:after="0"/>
+        <w:trPr>
+          <w:cantSplit/>
+        </w:trPr>
+        <w:tc>
+          <w:tcPr>
+            <w:tcW w:type="dxa" w:w="4206"/>
+            <w:tcBorders>
+              <w:top w:val="single" w:color="000000" w:sz="4"/>
+              <w:left w:val="single" w:color="000000" w:sz="4"/>
+              <w:bottom w:val="single" w:color="000000" w:sz="4"/>
+              <w:right w:val="single" w:color="000000" w:sz="4"/>
+            </w:tcBorders>
+            <w:tcMar>
+              <w:top w:type="dxa" w:w="20"/>
+              <w:left w:type="dxa" w:w="80"/>
+              <w:bottom w:type="dxa" w:w="20"/>
+              <w:right w:type="dxa" w:w="80"/>
+            </w:tcMar>
+            <w:vAlign w:val="center"/>
+          </w:tcPr>
+          <w:p>
+            <w:pPr>
+              <w:spacing w:before="0" w:after="0" w:line="240"/>
               <w:jc w:val="left"/>
             </w:pPr>
             <w:r>
@@ -410,8 +422,8 @@
                 <w:rFonts w:ascii="Arial" w:cs="Arial" w:eastAsia="Arial" w:hAnsi="Arial"/>
                 <w:b/>
                 <w:bCs/>
-                <w:sz w:val="20"/>
-                <w:szCs w:val="20"/>
+                <w:sz w:val="18"/>
+                <w:szCs w:val="18"/>
               </w:rPr>
               <w:t xml:space="preserve">Total Upah</w:t>
             </w:r>
@@ -427,16 +439,16 @@
               <w:right w:val="single" w:color="000000" w:sz="4"/>
             </w:tcBorders>
             <w:tcMar>
-              <w:top w:type="dxa" w:w="60"/>
-              <w:left w:type="dxa" w:w="100"/>
-              <w:bottom w:type="dxa" w:w="60"/>
-              <w:right w:type="dxa" w:w="100"/>
-            </w:tcMar>
-            <w:vAlign w:val="center"/>
-          </w:tcPr>
-          <w:p>
-            <w:pPr>
-              <w:spacing w:before="0" w:after="0"/>
+              <w:top w:type="dxa" w:w="20"/>
+              <w:left w:type="dxa" w:w="80"/>
+              <w:bottom w:type="dxa" w:w="20"/>
+              <w:right w:type="dxa" w:w="80"/>
+            </w:tcMar>
+            <w:vAlign w:val="center"/>
+          </w:tcPr>
+          <w:p>
+            <w:pPr>
+              <w:spacing w:before="0" w:after="0" w:line="240"/>
               <w:jc w:val="right"/>
             </w:pPr>
             <w:r>
@@ -444,8 +456,8 @@
                 <w:rFonts w:ascii="Arial" w:cs="Arial" w:eastAsia="Arial" w:hAnsi="Arial"/>
                 <w:b/>
                 <w:bCs/>
-                <w:sz w:val="20"/>
-                <w:szCs w:val="20"/>
+                <w:sz w:val="18"/>
+                <w:szCs w:val="18"/>
               </w:rPr>
               <w:t xml:space="preserve">Rp {total_upah}</w:t>
             </w:r>
@@ -461,16 +473,16 @@
               <w:right w:val="single" w:color="000000" w:sz="4"/>
             </w:tcBorders>
             <w:tcMar>
-              <w:top w:type="dxa" w:w="60"/>
-              <w:left w:type="dxa" w:w="100"/>
-              <w:bottom w:type="dxa" w:w="60"/>
-              <w:right w:type="dxa" w:w="100"/>
-            </w:tcMar>
-            <w:vAlign w:val="center"/>
-          </w:tcPr>
-          <w:p>
-            <w:pPr>
-              <w:spacing w:before="0" w:after="0"/>
+              <w:top w:type="dxa" w:w="20"/>
+              <w:left w:type="dxa" w:w="80"/>
+              <w:bottom w:type="dxa" w:w="20"/>
+              <w:right w:type="dxa" w:w="80"/>
+            </w:tcMar>
+            <w:vAlign w:val="center"/>
+          </w:tcPr>
+          <w:p>
+            <w:pPr>
+              <w:spacing w:before="0" w:after="0" w:line="240"/>
               <w:jc w:val="right"/>
             </w:pPr>
             <w:r>
@@ -478,8 +490,8 @@
                 <w:rFonts w:ascii="Arial" w:cs="Arial" w:eastAsia="Arial" w:hAnsi="Arial"/>
                 <w:b/>
                 <w:bCs/>
-                <w:sz w:val="20"/>
-                <w:szCs w:val="20"/>
+                <w:sz w:val="18"/>
+                <w:szCs w:val="18"/>
               </w:rPr>
               <w:t xml:space="preserve">Rp {total_upah}</w:t>
             </w:r>
@@ -489,21 +501,21 @@
     </w:tbl>
     <w:p>
       <w:pPr>
-        <w:spacing w:before="0" w:after="200"/>
+        <w:spacing w:before="0" w:after="120" w:line="240"/>
         <w:jc w:val="left"/>
       </w:pPr>
       <w:r>
         <w:rPr>
           <w:rFonts w:ascii="Arial" w:cs="Arial" w:eastAsia="Arial" w:hAnsi="Arial"/>
-          <w:sz w:val="20"/>
-          <w:szCs w:val="20"/>
+          <w:sz w:val="8"/>
+          <w:szCs w:val="8"/>
         </w:rPr>
         <w:t xml:space="preserve"/>
       </w:r>
     </w:p>
     <w:tbl>
       <w:tblPr>
-        <w:tblW w:type="dxa" w:w="9638"/>
+        <w:tblW w:type="dxa" w:w="10206"/>
         <w:tblBorders>
           <w:top w:val="single" w:color="auto" w:sz="4"/>
           <w:left w:val="single" w:color="auto" w:sz="4"/>
@@ -514,19 +526,20 @@
         </w:tblBorders>
       </w:tblPr>
       <w:tblGrid>
-        <w:gridCol w:w="600"/>
-        <w:gridCol w:w="3238"/>
+        <w:gridCol w:w="550"/>
+        <w:gridCol w:w="3606"/>
         <w:gridCol w:w="1900"/>
         <w:gridCol w:w="1900"/>
-        <w:gridCol w:w="2000"/>
+        <w:gridCol w:w="2250"/>
       </w:tblGrid>
       <w:tr>
         <w:trPr>
+          <w:cantSplit/>
           <w:tblHeader/>
         </w:trPr>
         <w:tc>
           <w:tcPr>
-            <w:tcW w:type="dxa" w:w="600"/>
+            <w:tcW w:type="dxa" w:w="550"/>
             <w:tcBorders>
               <w:top w:val="single" w:color="000000" w:sz="4"/>
               <w:left w:val="single" w:color="000000" w:sz="4"/>
@@ -535,16 +548,16 @@
             </w:tcBorders>
             <w:shd w:fill="E7E6E6" w:color="auto" w:val="clear"/>
             <w:tcMar>
-              <w:top w:type="dxa" w:w="60"/>
-              <w:left w:type="dxa" w:w="100"/>
-              <w:bottom w:type="dxa" w:w="60"/>
-              <w:right w:type="dxa" w:w="100"/>
-            </w:tcMar>
-            <w:vAlign w:val="center"/>
-          </w:tcPr>
-          <w:p>
-            <w:pPr>
-              <w:spacing w:before="0" w:after="0"/>
+              <w:top w:type="dxa" w:w="20"/>
+              <w:left w:type="dxa" w:w="80"/>
+              <w:bottom w:type="dxa" w:w="20"/>
+              <w:right w:type="dxa" w:w="80"/>
+            </w:tcMar>
+            <w:vAlign w:val="center"/>
+          </w:tcPr>
+          <w:p>
+            <w:pPr>
+              <w:spacing w:before="0" w:after="0" w:line="240"/>
               <w:jc w:val="center"/>
             </w:pPr>
             <w:r>
@@ -552,8 +565,8 @@
                 <w:rFonts w:ascii="Arial" w:cs="Arial" w:eastAsia="Arial" w:hAnsi="Arial"/>
                 <w:b/>
                 <w:bCs/>
-                <w:sz w:val="20"/>
-                <w:szCs w:val="20"/>
+                <w:sz w:val="18"/>
+                <w:szCs w:val="18"/>
               </w:rPr>
               <w:t xml:space="preserve">No.</w:t>
             </w:r>
@@ -561,7 +574,7 @@
         </w:tc>
         <w:tc>
           <w:tcPr>
-            <w:tcW w:type="dxa" w:w="3238"/>
+            <w:tcW w:type="dxa" w:w="3606"/>
             <w:tcBorders>
               <w:top w:val="single" w:color="000000" w:sz="4"/>
               <w:left w:val="single" w:color="000000" w:sz="4"/>
@@ -570,16 +583,16 @@
             </w:tcBorders>
             <w:shd w:fill="E7E6E6" w:color="auto" w:val="clear"/>
             <w:tcMar>
-              <w:top w:type="dxa" w:w="60"/>
-              <w:left w:type="dxa" w:w="100"/>
-              <w:bottom w:type="dxa" w:w="60"/>
-              <w:right w:type="dxa" w:w="100"/>
-            </w:tcMar>
-            <w:vAlign w:val="center"/>
-          </w:tcPr>
-          <w:p>
-            <w:pPr>
-              <w:spacing w:before="0" w:after="0"/>
+              <w:top w:type="dxa" w:w="20"/>
+              <w:left w:type="dxa" w:w="80"/>
+              <w:bottom w:type="dxa" w:w="20"/>
+              <w:right w:type="dxa" w:w="80"/>
+            </w:tcMar>
+            <w:vAlign w:val="center"/>
+          </w:tcPr>
+          <w:p>
+            <w:pPr>
+              <w:spacing w:before="0" w:after="0" w:line="240"/>
               <w:jc w:val="center"/>
             </w:pPr>
             <w:r>
@@ -587,8 +600,8 @@
                 <w:rFonts w:ascii="Arial" w:cs="Arial" w:eastAsia="Arial" w:hAnsi="Arial"/>
                 <w:b/>
                 <w:bCs/>
-                <w:sz w:val="20"/>
-                <w:szCs w:val="20"/>
+                <w:sz w:val="18"/>
+                <w:szCs w:val="18"/>
               </w:rPr>
               <w:t xml:space="preserve">Nama Buruh</w:t>
             </w:r>
@@ -605,16 +618,16 @@
             </w:tcBorders>
             <w:shd w:fill="E7E6E6" w:color="auto" w:val="clear"/>
             <w:tcMar>
-              <w:top w:type="dxa" w:w="60"/>
-              <w:left w:type="dxa" w:w="100"/>
-              <w:bottom w:type="dxa" w:w="60"/>
-              <w:right w:type="dxa" w:w="100"/>
-            </w:tcMar>
-            <w:vAlign w:val="center"/>
-          </w:tcPr>
-          <w:p>
-            <w:pPr>
-              <w:spacing w:before="0" w:after="0"/>
+              <w:top w:type="dxa" w:w="20"/>
+              <w:left w:type="dxa" w:w="80"/>
+              <w:bottom w:type="dxa" w:w="20"/>
+              <w:right w:type="dxa" w:w="80"/>
+            </w:tcMar>
+            <w:vAlign w:val="center"/>
+          </w:tcPr>
+          <w:p>
+            <w:pPr>
+              <w:spacing w:before="0" w:after="0" w:line="240"/>
               <w:jc w:val="center"/>
             </w:pPr>
             <w:r>
@@ -622,8 +635,8 @@
                 <w:rFonts w:ascii="Arial" w:cs="Arial" w:eastAsia="Arial" w:hAnsi="Arial"/>
                 <w:b/>
                 <w:bCs/>
-                <w:sz w:val="20"/>
-                <w:szCs w:val="20"/>
+                <w:sz w:val="18"/>
+                <w:szCs w:val="18"/>
               </w:rPr>
               <w:t xml:space="preserve">Penyaluran</w:t>
             </w:r>
@@ -640,16 +653,16 @@
             </w:tcBorders>
             <w:shd w:fill="E7E6E6" w:color="auto" w:val="clear"/>
             <w:tcMar>
-              <w:top w:type="dxa" w:w="60"/>
-              <w:left w:type="dxa" w:w="100"/>
-              <w:bottom w:type="dxa" w:w="60"/>
-              <w:right w:type="dxa" w:w="100"/>
-            </w:tcMar>
-            <w:vAlign w:val="center"/>
-          </w:tcPr>
-          <w:p>
-            <w:pPr>
-              <w:spacing w:before="0" w:after="0"/>
+              <w:top w:type="dxa" w:w="20"/>
+              <w:left w:type="dxa" w:w="80"/>
+              <w:bottom w:type="dxa" w:w="20"/>
+              <w:right w:type="dxa" w:w="80"/>
+            </w:tcMar>
+            <w:vAlign w:val="center"/>
+          </w:tcPr>
+          <w:p>
+            <w:pPr>
+              <w:spacing w:before="0" w:after="0" w:line="240"/>
               <w:jc w:val="center"/>
             </w:pPr>
             <w:r>
@@ -657,8 +670,8 @@
                 <w:rFonts w:ascii="Arial" w:cs="Arial" w:eastAsia="Arial" w:hAnsi="Arial"/>
                 <w:b/>
                 <w:bCs/>
-                <w:sz w:val="20"/>
-                <w:szCs w:val="20"/>
+                <w:sz w:val="18"/>
+                <w:szCs w:val="18"/>
               </w:rPr>
               <w:t xml:space="preserve">Jumlah Diterima</w:t>
             </w:r>
@@ -666,7 +679,7 @@
         </w:tc>
         <w:tc>
           <w:tcPr>
-            <w:tcW w:type="dxa" w:w="2000"/>
+            <w:tcW w:type="dxa" w:w="2250"/>
             <w:tcBorders>
               <w:top w:val="single" w:color="000000" w:sz="4"/>
               <w:left w:val="single" w:color="000000" w:sz="4"/>
@@ -675,16 +688,16 @@
             </w:tcBorders>
             <w:shd w:fill="E7E6E6" w:color="auto" w:val="clear"/>
             <w:tcMar>
-              <w:top w:type="dxa" w:w="60"/>
-              <w:left w:type="dxa" w:w="100"/>
-              <w:bottom w:type="dxa" w:w="60"/>
-              <w:right w:type="dxa" w:w="100"/>
-            </w:tcMar>
-            <w:vAlign w:val="center"/>
-          </w:tcPr>
-          <w:p>
-            <w:pPr>
-              <w:spacing w:before="0" w:after="0"/>
+              <w:top w:type="dxa" w:w="20"/>
+              <w:left w:type="dxa" w:w="80"/>
+              <w:bottom w:type="dxa" w:w="20"/>
+              <w:right w:type="dxa" w:w="80"/>
+            </w:tcMar>
+            <w:vAlign w:val="center"/>
+          </w:tcPr>
+          <w:p>
+            <w:pPr>
+              <w:spacing w:before="0" w:after="0" w:line="240"/>
               <w:jc w:val="center"/>
             </w:pPr>
             <w:r>
@@ -692,8 +705,8 @@
                 <w:rFonts w:ascii="Arial" w:cs="Arial" w:eastAsia="Arial" w:hAnsi="Arial"/>
                 <w:b/>
                 <w:bCs/>
-                <w:sz w:val="20"/>
-                <w:szCs w:val="20"/>
+                <w:sz w:val="18"/>
+                <w:szCs w:val="18"/>
               </w:rPr>
               <w:t xml:space="preserve">Tanda Terima</w:t>
             </w:r>
@@ -701,33 +714,37 @@
         </w:tc>
       </w:tr>
       <w:tr>
-        <w:tc>
-          <w:tcPr>
-            <w:tcW w:type="dxa" w:w="600"/>
-            <w:tcBorders>
-              <w:top w:val="single" w:color="000000" w:sz="4"/>
-              <w:left w:val="single" w:color="000000" w:sz="4"/>
-              <w:bottom w:val="single" w:color="000000" w:sz="4"/>
-              <w:right w:val="single" w:color="000000" w:sz="4"/>
-            </w:tcBorders>
-            <w:tcMar>
-              <w:top w:type="dxa" w:w="60"/>
-              <w:left w:type="dxa" w:w="100"/>
-              <w:bottom w:type="dxa" w:w="60"/>
-              <w:right w:type="dxa" w:w="100"/>
-            </w:tcMar>
-            <w:vAlign w:val="center"/>
-          </w:tcPr>
-          <w:p>
-            <w:pPr>
-              <w:spacing w:before="0" w:after="0"/>
-              <w:jc w:val="center"/>
-            </w:pPr>
-            <w:r>
-              <w:rPr>
-                <w:rFonts w:ascii="Arial" w:cs="Arial" w:eastAsia="Arial" w:hAnsi="Arial"/>
-                <w:sz w:val="20"/>
-                <w:szCs w:val="20"/>
+        <w:trPr>
+          <w:cantSplit/>
+          <w:trHeight w:val="440" w:hRule="atLeast"/>
+        </w:trPr>
+        <w:tc>
+          <w:tcPr>
+            <w:tcW w:type="dxa" w:w="550"/>
+            <w:tcBorders>
+              <w:top w:val="single" w:color="000000" w:sz="4"/>
+              <w:left w:val="single" w:color="000000" w:sz="4"/>
+              <w:bottom w:val="single" w:color="000000" w:sz="4"/>
+              <w:right w:val="single" w:color="000000" w:sz="4"/>
+            </w:tcBorders>
+            <w:tcMar>
+              <w:top w:type="dxa" w:w="20"/>
+              <w:left w:type="dxa" w:w="80"/>
+              <w:bottom w:type="dxa" w:w="20"/>
+              <w:right w:type="dxa" w:w="80"/>
+            </w:tcMar>
+            <w:vAlign w:val="center"/>
+          </w:tcPr>
+          <w:p>
+            <w:pPr>
+              <w:spacing w:before="0" w:after="0" w:line="240"/>
+              <w:jc w:val="center"/>
+            </w:pPr>
+            <w:r>
+              <w:rPr>
+                <w:rFonts w:ascii="Arial" w:cs="Arial" w:eastAsia="Arial" w:hAnsi="Arial"/>
+                <w:sz w:val="18"/>
+                <w:szCs w:val="18"/>
               </w:rPr>
               <w:t xml:space="preserve">{#buruh}{no}</w:t>
             </w:r>
@@ -735,31 +752,31 @@
         </w:tc>
         <w:tc>
           <w:tcPr>
-            <w:tcW w:type="dxa" w:w="3238"/>
-            <w:tcBorders>
-              <w:top w:val="single" w:color="000000" w:sz="4"/>
-              <w:left w:val="single" w:color="000000" w:sz="4"/>
-              <w:bottom w:val="single" w:color="000000" w:sz="4"/>
-              <w:right w:val="single" w:color="000000" w:sz="4"/>
-            </w:tcBorders>
-            <w:tcMar>
-              <w:top w:type="dxa" w:w="60"/>
-              <w:left w:type="dxa" w:w="100"/>
-              <w:bottom w:type="dxa" w:w="60"/>
-              <w:right w:type="dxa" w:w="100"/>
-            </w:tcMar>
-            <w:vAlign w:val="center"/>
-          </w:tcPr>
-          <w:p>
-            <w:pPr>
-              <w:spacing w:before="0" w:after="0"/>
+            <w:tcW w:type="dxa" w:w="3606"/>
+            <w:tcBorders>
+              <w:top w:val="single" w:color="000000" w:sz="4"/>
+              <w:left w:val="single" w:color="000000" w:sz="4"/>
+              <w:bottom w:val="single" w:color="000000" w:sz="4"/>
+              <w:right w:val="single" w:color="000000" w:sz="4"/>
+            </w:tcBorders>
+            <w:tcMar>
+              <w:top w:type="dxa" w:w="20"/>
+              <w:left w:type="dxa" w:w="80"/>
+              <w:bottom w:type="dxa" w:w="20"/>
+              <w:right w:type="dxa" w:w="80"/>
+            </w:tcMar>
+            <w:vAlign w:val="center"/>
+          </w:tcPr>
+          <w:p>
+            <w:pPr>
+              <w:spacing w:before="0" w:after="0" w:line="240"/>
               <w:jc w:val="left"/>
             </w:pPr>
             <w:r>
               <w:rPr>
                 <w:rFonts w:ascii="Arial" w:cs="Arial" w:eastAsia="Arial" w:hAnsi="Arial"/>
-                <w:sz w:val="20"/>
-                <w:szCs w:val="20"/>
+                <w:sz w:val="18"/>
+                <w:szCs w:val="18"/>
               </w:rPr>
               <w:t xml:space="preserve">{nama}</w:t>
             </w:r>
@@ -775,23 +792,23 @@
               <w:right w:val="single" w:color="000000" w:sz="4"/>
             </w:tcBorders>
             <w:tcMar>
-              <w:top w:type="dxa" w:w="60"/>
-              <w:left w:type="dxa" w:w="100"/>
-              <w:bottom w:type="dxa" w:w="60"/>
-              <w:right w:type="dxa" w:w="100"/>
-            </w:tcMar>
-            <w:vAlign w:val="center"/>
-          </w:tcPr>
-          <w:p>
-            <w:pPr>
-              <w:spacing w:before="0" w:after="0"/>
+              <w:top w:type="dxa" w:w="20"/>
+              <w:left w:type="dxa" w:w="80"/>
+              <w:bottom w:type="dxa" w:w="20"/>
+              <w:right w:type="dxa" w:w="80"/>
+            </w:tcMar>
+            <w:vAlign w:val="center"/>
+          </w:tcPr>
+          <w:p>
+            <w:pPr>
+              <w:spacing w:before="0" w:after="0" w:line="240"/>
               <w:jc w:val="right"/>
             </w:pPr>
             <w:r>
               <w:rPr>
                 <w:rFonts w:ascii="Arial" w:cs="Arial" w:eastAsia="Arial" w:hAnsi="Arial"/>
-                <w:sz w:val="20"/>
-                <w:szCs w:val="20"/>
+                <w:sz w:val="18"/>
+                <w:szCs w:val="18"/>
               </w:rPr>
               <w:t xml:space="preserve">Rp {penyaluran}</w:t>
             </w:r>
@@ -807,23 +824,23 @@
               <w:right w:val="single" w:color="000000" w:sz="4"/>
             </w:tcBorders>
             <w:tcMar>
-              <w:top w:type="dxa" w:w="60"/>
-              <w:left w:type="dxa" w:w="100"/>
-              <w:bottom w:type="dxa" w:w="60"/>
-              <w:right w:type="dxa" w:w="100"/>
-            </w:tcMar>
-            <w:vAlign w:val="center"/>
-          </w:tcPr>
-          <w:p>
-            <w:pPr>
-              <w:spacing w:before="0" w:after="0"/>
+              <w:top w:type="dxa" w:w="20"/>
+              <w:left w:type="dxa" w:w="80"/>
+              <w:bottom w:type="dxa" w:w="20"/>
+              <w:right w:type="dxa" w:w="80"/>
+            </w:tcMar>
+            <w:vAlign w:val="center"/>
+          </w:tcPr>
+          <w:p>
+            <w:pPr>
+              <w:spacing w:before="0" w:after="0" w:line="240"/>
               <w:jc w:val="right"/>
             </w:pPr>
             <w:r>
               <w:rPr>
                 <w:rFonts w:ascii="Arial" w:cs="Arial" w:eastAsia="Arial" w:hAnsi="Arial"/>
-                <w:sz w:val="20"/>
-                <w:szCs w:val="20"/>
+                <w:sz w:val="18"/>
+                <w:szCs w:val="18"/>
               </w:rPr>
               <w:t xml:space="preserve">Rp {diterima}</w:t>
             </w:r>
@@ -831,55 +848,63 @@
         </w:tc>
         <w:tc>
           <w:tcPr>
-            <w:tcW w:type="dxa" w:w="2000"/>
-            <w:tcBorders>
-              <w:top w:val="single" w:color="000000" w:sz="4"/>
-              <w:left w:val="single" w:color="000000" w:sz="4"/>
-              <w:bottom w:val="single" w:color="000000" w:sz="4"/>
-              <w:right w:val="single" w:color="000000" w:sz="4"/>
-            </w:tcBorders>
-            <w:tcMar>
-              <w:top w:type="dxa" w:w="60"/>
-              <w:left w:type="dxa" w:w="100"/>
-              <w:bottom w:type="dxa" w:w="60"/>
-              <w:right w:type="dxa" w:w="100"/>
-            </w:tcMar>
-            <w:vAlign w:val="center"/>
-          </w:tcPr>
-          <w:p>
-            <w:pPr>
-              <w:spacing w:before="0" w:after="0"/>
+            <w:tcW w:type="dxa" w:w="2250"/>
+            <w:tcBorders>
+              <w:top w:val="single" w:color="000000" w:sz="4"/>
+              <w:left w:val="single" w:color="000000" w:sz="4"/>
+              <w:bottom w:val="single" w:color="000000" w:sz="4"/>
+              <w:right w:val="single" w:color="000000" w:sz="4"/>
+            </w:tcBorders>
+            <w:tcMar>
+              <w:top w:type="dxa" w:w="20"/>
+              <w:left w:type="dxa" w:w="80"/>
+              <w:bottom w:type="dxa" w:w="20"/>
+              <w:right w:type="dxa" w:w="80"/>
+            </w:tcMar>
+            <w:vAlign w:val="center"/>
+          </w:tcPr>
+          <w:p>
+            <w:pPr>
+              <w:tabs>
+                <w:tab w:val="left" w:pos="1050"/>
+              </w:tabs>
+              <w:spacing w:before="0" w:after="0" w:line="240"/>
               <w:jc w:val="left"/>
             </w:pPr>
             <w:r>
               <w:rPr>
                 <w:rFonts w:ascii="Arial" w:cs="Arial" w:eastAsia="Arial" w:hAnsi="Arial"/>
-                <w:sz w:val="20"/>
-                <w:szCs w:val="20"/>
-              </w:rPr>
-              <w:t xml:space="preserve">{#ganjil}{no}. ..............{/ganjil}</w:t>
-            </w:r>
-          </w:p>
-          <w:p>
-            <w:pPr>
-              <w:spacing w:before="0" w:after="0"/>
-              <w:jc w:val="right"/>
-            </w:pPr>
-            <w:r>
-              <w:rPr>
-                <w:rFonts w:ascii="Arial" w:cs="Arial" w:eastAsia="Arial" w:hAnsi="Arial"/>
-                <w:sz w:val="20"/>
-                <w:szCs w:val="20"/>
-              </w:rPr>
-              <w:t xml:space="preserve">{^ganjil}{no}. ..............{/ganjil}{/buruh}</w:t>
+                <w:sz w:val="18"/>
+                <w:szCs w:val="18"/>
+              </w:rPr>
+              <w:t xml:space="preserve">{#ganjil}{no}. ..........{/ganjil}{^ganjil}</w:t>
+            </w:r>
+            <w:r>
+              <w:rPr>
+                <w:rFonts w:ascii="Arial" w:cs="Arial" w:eastAsia="Arial" w:hAnsi="Arial"/>
+                <w:sz w:val="18"/>
+                <w:szCs w:val="18"/>
+              </w:rPr>
+              <w:t xml:space="preserve">	</w:t>
+            </w:r>
+            <w:r>
+              <w:rPr>
+                <w:rFonts w:ascii="Arial" w:cs="Arial" w:eastAsia="Arial" w:hAnsi="Arial"/>
+                <w:sz w:val="18"/>
+                <w:szCs w:val="18"/>
+              </w:rPr>
+              <w:t xml:space="preserve">{no}. ..........{/ganjil}{/buruh}</w:t>
             </w:r>
           </w:p>
         </w:tc>
       </w:tr>
       <w:tr>
-        <w:tc>
-          <w:tcPr>
-            <w:tcW w:type="dxa" w:w="600"/>
+        <w:trPr>
+          <w:cantSplit/>
+        </w:trPr>
+        <w:tc>
+          <w:tcPr>
+            <w:tcW w:type="dxa" w:w="550"/>
             <w:tcBorders>
               <w:top w:val="single" w:color="000000" w:sz="4"/>
               <w:left w:val="single" w:color="000000" w:sz="4"/>
@@ -888,23 +913,23 @@
             </w:tcBorders>
             <w:shd w:fill="E7E6E6" w:color="auto" w:val="clear"/>
             <w:tcMar>
-              <w:top w:type="dxa" w:w="60"/>
-              <w:left w:type="dxa" w:w="100"/>
-              <w:bottom w:type="dxa" w:w="60"/>
-              <w:right w:type="dxa" w:w="100"/>
-            </w:tcMar>
-            <w:vAlign w:val="center"/>
-          </w:tcPr>
-          <w:p>
-            <w:pPr>
-              <w:spacing w:before="0" w:after="0"/>
+              <w:top w:type="dxa" w:w="20"/>
+              <w:left w:type="dxa" w:w="80"/>
+              <w:bottom w:type="dxa" w:w="20"/>
+              <w:right w:type="dxa" w:w="80"/>
+            </w:tcMar>
+            <w:vAlign w:val="center"/>
+          </w:tcPr>
+          <w:p>
+            <w:pPr>
+              <w:spacing w:before="0" w:after="0" w:line="240"/>
               <w:jc w:val="left"/>
             </w:pPr>
             <w:r>
               <w:rPr>
                 <w:rFonts w:ascii="Arial" w:cs="Arial" w:eastAsia="Arial" w:hAnsi="Arial"/>
-                <w:sz w:val="20"/>
-                <w:szCs w:val="20"/>
+                <w:sz w:val="18"/>
+                <w:szCs w:val="18"/>
               </w:rPr>
               <w:t xml:space="preserve"/>
             </w:r>
@@ -912,7 +937,7 @@
         </w:tc>
         <w:tc>
           <w:tcPr>
-            <w:tcW w:type="dxa" w:w="3238"/>
+            <w:tcW w:type="dxa" w:w="3606"/>
             <w:tcBorders>
               <w:top w:val="single" w:color="000000" w:sz="4"/>
               <w:left w:val="single" w:color="000000" w:sz="4"/>
@@ -921,16 +946,16 @@
             </w:tcBorders>
             <w:shd w:fill="E7E6E6" w:color="auto" w:val="clear"/>
             <w:tcMar>
-              <w:top w:type="dxa" w:w="60"/>
-              <w:left w:type="dxa" w:w="100"/>
-              <w:bottom w:type="dxa" w:w="60"/>
-              <w:right w:type="dxa" w:w="100"/>
-            </w:tcMar>
-            <w:vAlign w:val="center"/>
-          </w:tcPr>
-          <w:p>
-            <w:pPr>
-              <w:spacing w:before="0" w:after="0"/>
+              <w:top w:type="dxa" w:w="20"/>
+              <w:left w:type="dxa" w:w="80"/>
+              <w:bottom w:type="dxa" w:w="20"/>
+              <w:right w:type="dxa" w:w="80"/>
+            </w:tcMar>
+            <w:vAlign w:val="center"/>
+          </w:tcPr>
+          <w:p>
+            <w:pPr>
+              <w:spacing w:before="0" w:after="0" w:line="240"/>
               <w:jc w:val="center"/>
             </w:pPr>
             <w:r>
@@ -938,8 +963,8 @@
                 <w:rFonts w:ascii="Arial" w:cs="Arial" w:eastAsia="Arial" w:hAnsi="Arial"/>
                 <w:b/>
                 <w:bCs/>
-                <w:sz w:val="20"/>
-                <w:szCs w:val="20"/>
+                <w:sz w:val="18"/>
+                <w:szCs w:val="18"/>
               </w:rPr>
               <w:t xml:space="preserve">Total</w:t>
             </w:r>
@@ -956,16 +981,16 @@
             </w:tcBorders>
             <w:shd w:fill="E7E6E6" w:color="auto" w:val="clear"/>
             <w:tcMar>
-              <w:top w:type="dxa" w:w="60"/>
-              <w:left w:type="dxa" w:w="100"/>
-              <w:bottom w:type="dxa" w:w="60"/>
-              <w:right w:type="dxa" w:w="100"/>
-            </w:tcMar>
-            <w:vAlign w:val="center"/>
-          </w:tcPr>
-          <w:p>
-            <w:pPr>
-              <w:spacing w:before="0" w:after="0"/>
+              <w:top w:type="dxa" w:w="20"/>
+              <w:left w:type="dxa" w:w="80"/>
+              <w:bottom w:type="dxa" w:w="20"/>
+              <w:right w:type="dxa" w:w="80"/>
+            </w:tcMar>
+            <w:vAlign w:val="center"/>
+          </w:tcPr>
+          <w:p>
+            <w:pPr>
+              <w:spacing w:before="0" w:after="0" w:line="240"/>
               <w:jc w:val="right"/>
             </w:pPr>
             <w:r>
@@ -973,8 +998,8 @@
                 <w:rFonts w:ascii="Arial" w:cs="Arial" w:eastAsia="Arial" w:hAnsi="Arial"/>
                 <w:b/>
                 <w:bCs/>
-                <w:sz w:val="20"/>
-                <w:szCs w:val="20"/>
+                <w:sz w:val="18"/>
+                <w:szCs w:val="18"/>
               </w:rPr>
               <w:t xml:space="preserve">Rp {total_penyaluran}</w:t>
             </w:r>
@@ -991,16 +1016,16 @@
             </w:tcBorders>
             <w:shd w:fill="E7E6E6" w:color="auto" w:val="clear"/>
             <w:tcMar>
-              <w:top w:type="dxa" w:w="60"/>
-              <w:left w:type="dxa" w:w="100"/>
-              <w:bottom w:type="dxa" w:w="60"/>
-              <w:right w:type="dxa" w:w="100"/>
-            </w:tcMar>
-            <w:vAlign w:val="center"/>
-          </w:tcPr>
-          <w:p>
-            <w:pPr>
-              <w:spacing w:before="0" w:after="0"/>
+              <w:top w:type="dxa" w:w="20"/>
+              <w:left w:type="dxa" w:w="80"/>
+              <w:bottom w:type="dxa" w:w="20"/>
+              <w:right w:type="dxa" w:w="80"/>
+            </w:tcMar>
+            <w:vAlign w:val="center"/>
+          </w:tcPr>
+          <w:p>
+            <w:pPr>
+              <w:spacing w:before="0" w:after="0" w:line="240"/>
               <w:jc w:val="right"/>
             </w:pPr>
             <w:r>
@@ -1008,8 +1033,8 @@
                 <w:rFonts w:ascii="Arial" w:cs="Arial" w:eastAsia="Arial" w:hAnsi="Arial"/>
                 <w:b/>
                 <w:bCs/>
-                <w:sz w:val="20"/>
-                <w:szCs w:val="20"/>
+                <w:sz w:val="18"/>
+                <w:szCs w:val="18"/>
               </w:rPr>
               <w:t xml:space="preserve">Rp {total_diterima}</w:t>
             </w:r>
@@ -1017,7 +1042,7 @@
         </w:tc>
         <w:tc>
           <w:tcPr>
-            <w:tcW w:type="dxa" w:w="2000"/>
+            <w:tcW w:type="dxa" w:w="2250"/>
             <w:tcBorders>
               <w:top w:val="single" w:color="000000" w:sz="4"/>
               <w:left w:val="single" w:color="000000" w:sz="4"/>
@@ -1026,23 +1051,23 @@
             </w:tcBorders>
             <w:shd w:fill="E7E6E6" w:color="auto" w:val="clear"/>
             <w:tcMar>
-              <w:top w:type="dxa" w:w="60"/>
-              <w:left w:type="dxa" w:w="100"/>
-              <w:bottom w:type="dxa" w:w="60"/>
-              <w:right w:type="dxa" w:w="100"/>
-            </w:tcMar>
-            <w:vAlign w:val="center"/>
-          </w:tcPr>
-          <w:p>
-            <w:pPr>
-              <w:spacing w:before="0" w:after="0"/>
+              <w:top w:type="dxa" w:w="20"/>
+              <w:left w:type="dxa" w:w="80"/>
+              <w:bottom w:type="dxa" w:w="20"/>
+              <w:right w:type="dxa" w:w="80"/>
+            </w:tcMar>
+            <w:vAlign w:val="center"/>
+          </w:tcPr>
+          <w:p>
+            <w:pPr>
+              <w:spacing w:before="0" w:after="0" w:line="240"/>
               <w:jc w:val="left"/>
             </w:pPr>
             <w:r>
               <w:rPr>
                 <w:rFonts w:ascii="Arial" w:cs="Arial" w:eastAsia="Arial" w:hAnsi="Arial"/>
-                <w:sz w:val="20"/>
-                <w:szCs w:val="20"/>
+                <w:sz w:val="18"/>
+                <w:szCs w:val="18"/>
               </w:rPr>
               <w:t xml:space="preserve"/>
             </w:r>
@@ -1052,21 +1077,21 @@
     </w:tbl>
     <w:p>
       <w:pPr>
-        <w:spacing w:before="0" w:after="200"/>
+        <w:spacing w:before="0" w:after="160" w:line="240"/>
         <w:jc w:val="left"/>
       </w:pPr>
       <w:r>
         <w:rPr>
           <w:rFonts w:ascii="Arial" w:cs="Arial" w:eastAsia="Arial" w:hAnsi="Arial"/>
-          <w:sz w:val="20"/>
-          <w:szCs w:val="20"/>
+          <w:sz w:val="8"/>
+          <w:szCs w:val="8"/>
         </w:rPr>
         <w:t xml:space="preserve"/>
       </w:r>
     </w:p>
     <w:tbl>
       <w:tblPr>
-        <w:tblW w:type="dxa" w:w="9638"/>
+        <w:tblW w:type="dxa" w:w="10206"/>
         <w:tblBorders>
           <w:top w:val="none" w:color="FFFFFF" w:sz="0"/>
           <w:left w:val="none" w:color="FFFFFF" w:sz="0"/>
@@ -1077,13 +1102,16 @@
         </w:tblBorders>
       </w:tblPr>
       <w:tblGrid>
-        <w:gridCol w:w="4819"/>
-        <w:gridCol w:w="4819"/>
+        <w:gridCol w:w="5103"/>
+        <w:gridCol w:w="5103"/>
       </w:tblGrid>
       <w:tr>
-        <w:tc>
-          <w:tcPr>
-            <w:tcW w:type="dxa" w:w="4819"/>
+        <w:trPr>
+          <w:cantSplit/>
+        </w:trPr>
+        <w:tc>
+          <w:tcPr>
+            <w:tcW w:type="dxa" w:w="5103"/>
             <w:tcBorders>
               <w:top w:val="none" w:color="FFFFFF" w:sz="0"/>
               <w:left w:val="none" w:color="FFFFFF" w:sz="0"/>
@@ -1091,16 +1119,44 @@
               <w:right w:val="none" w:color="FFFFFF" w:sz="0"/>
             </w:tcBorders>
             <w:tcMar>
-              <w:top w:type="dxa" w:w="60"/>
-              <w:left w:type="dxa" w:w="100"/>
-              <w:bottom w:type="dxa" w:w="60"/>
-              <w:right w:type="dxa" w:w="100"/>
+              <w:top w:type="dxa" w:w="20"/>
+              <w:left w:type="dxa" w:w="80"/>
+              <w:bottom w:type="dxa" w:w="20"/>
+              <w:right w:type="dxa" w:w="80"/>
             </w:tcMar>
             <w:vAlign w:val="top"/>
           </w:tcPr>
           <w:p>
             <w:pPr>
-              <w:spacing w:before="0" w:after="0"/>
+              <w:spacing w:before="0" w:after="0" w:line="240"/>
+              <w:jc w:val="center"/>
+            </w:pPr>
+            <w:r>
+              <w:rPr>
+                <w:rFonts w:ascii="Arial" w:cs="Arial" w:eastAsia="Arial" w:hAnsi="Arial"/>
+                <w:sz w:val="20"/>
+                <w:szCs w:val="20"/>
+              </w:rPr>
+              <w:t xml:space="preserve">Mengetahui,</w:t>
+            </w:r>
+          </w:p>
+          <w:p>
+            <w:pPr>
+              <w:spacing w:before="0" w:after="0" w:line="240"/>
+              <w:jc w:val="center"/>
+            </w:pPr>
+            <w:r>
+              <w:rPr>
+                <w:rFonts w:ascii="Arial" w:cs="Arial" w:eastAsia="Arial" w:hAnsi="Arial"/>
+                <w:sz w:val="20"/>
+                <w:szCs w:val="20"/>
+              </w:rPr>
+              <w:t xml:space="preserve"> </w:t>
+            </w:r>
+          </w:p>
+          <w:p>
+            <w:pPr>
+              <w:spacing w:before="0" w:after="0" w:line="240"/>
               <w:jc w:val="center"/>
             </w:pPr>
             <w:r>
@@ -1114,21 +1170,7 @@
           </w:p>
           <w:p>
             <w:pPr>
-              <w:spacing w:before="0" w:after="0"/>
-              <w:jc w:val="center"/>
-            </w:pPr>
-            <w:r>
-              <w:rPr>
-                <w:rFonts w:ascii="Arial" w:cs="Arial" w:eastAsia="Arial" w:hAnsi="Arial"/>
-                <w:sz w:val="20"/>
-                <w:szCs w:val="20"/>
-              </w:rPr>
-              <w:t xml:space="preserve">Mengetahui,</w:t>
-            </w:r>
-          </w:p>
-          <w:p>
-            <w:pPr>
-              <w:spacing w:before="0" w:after="0"/>
+              <w:spacing w:before="0" w:after="0" w:line="240"/>
               <w:jc w:val="center"/>
             </w:pPr>
             <w:r>
@@ -1142,7 +1184,7 @@
           </w:p>
           <w:p>
             <w:pPr>
-              <w:spacing w:before="0" w:after="0"/>
+              <w:spacing w:before="0" w:after="0" w:line="240"/>
               <w:jc w:val="center"/>
             </w:pPr>
             <w:r>
@@ -1156,7 +1198,7 @@
           </w:p>
           <w:p>
             <w:pPr>
-              <w:spacing w:before="0" w:after="0"/>
+              <w:spacing w:before="0" w:after="0" w:line="240"/>
               <w:jc w:val="center"/>
             </w:pPr>
             <w:r>
@@ -1170,7 +1212,7 @@
           </w:p>
           <w:p>
             <w:pPr>
-              <w:spacing w:before="0" w:after="0"/>
+              <w:spacing w:before="0" w:after="0" w:line="240"/>
               <w:jc w:val="center"/>
             </w:pPr>
             <w:r>
@@ -1184,7 +1226,21 @@
           </w:p>
           <w:p>
             <w:pPr>
-              <w:spacing w:before="0" w:after="0"/>
+              <w:spacing w:before="0" w:after="0" w:line="240"/>
+              <w:jc w:val="center"/>
+            </w:pPr>
+            <w:r>
+              <w:rPr>
+                <w:rFonts w:ascii="Arial" w:cs="Arial" w:eastAsia="Arial" w:hAnsi="Arial"/>
+                <w:sz w:val="20"/>
+                <w:szCs w:val="20"/>
+              </w:rPr>
+              <w:t xml:space="preserve"/>
+            </w:r>
+          </w:p>
+          <w:p>
+            <w:pPr>
+              <w:spacing w:before="0" w:after="0" w:line="240"/>
               <w:jc w:val="center"/>
             </w:pPr>
             <w:r>
@@ -1201,7 +1257,7 @@
           </w:p>
           <w:p>
             <w:pPr>
-              <w:spacing w:before="0" w:after="0"/>
+              <w:spacing w:before="0" w:after="0" w:line="240"/>
               <w:jc w:val="center"/>
             </w:pPr>
             <w:r>
@@ -1216,7 +1272,7 @@
         </w:tc>
         <w:tc>
           <w:tcPr>
-            <w:tcW w:type="dxa" w:w="4819"/>
+            <w:tcW w:type="dxa" w:w="5103"/>
             <w:tcBorders>
               <w:top w:val="none" w:color="FFFFFF" w:sz="0"/>
               <w:left w:val="none" w:color="FFFFFF" w:sz="0"/>
@@ -1224,16 +1280,16 @@
               <w:right w:val="none" w:color="FFFFFF" w:sz="0"/>
             </w:tcBorders>
             <w:tcMar>
-              <w:top w:type="dxa" w:w="60"/>
-              <w:left w:type="dxa" w:w="100"/>
-              <w:bottom w:type="dxa" w:w="60"/>
-              <w:right w:type="dxa" w:w="100"/>
+              <w:top w:type="dxa" w:w="20"/>
+              <w:left w:type="dxa" w:w="80"/>
+              <w:bottom w:type="dxa" w:w="20"/>
+              <w:right w:type="dxa" w:w="80"/>
             </w:tcMar>
             <w:vAlign w:val="top"/>
           </w:tcPr>
           <w:p>
             <w:pPr>
-              <w:spacing w:before="0" w:after="0"/>
+              <w:spacing w:before="0" w:after="0" w:line="240"/>
               <w:jc w:val="center"/>
             </w:pPr>
             <w:r>
@@ -1247,7 +1303,7 @@
           </w:p>
           <w:p>
             <w:pPr>
-              <w:spacing w:before="0" w:after="0"/>
+              <w:spacing w:before="0" w:after="0" w:line="240"/>
               <w:jc w:val="center"/>
             </w:pPr>
             <w:r>
@@ -1261,7 +1317,7 @@
           </w:p>
           <w:p>
             <w:pPr>
-              <w:spacing w:before="0" w:after="0"/>
+              <w:spacing w:before="0" w:after="0" w:line="240"/>
               <w:jc w:val="center"/>
             </w:pPr>
             <w:r>
@@ -1275,7 +1331,7 @@
           </w:p>
           <w:p>
             <w:pPr>
-              <w:spacing w:before="0" w:after="0"/>
+              <w:spacing w:before="0" w:after="0" w:line="240"/>
               <w:jc w:val="center"/>
             </w:pPr>
             <w:r>
@@ -1289,7 +1345,7 @@
           </w:p>
           <w:p>
             <w:pPr>
-              <w:spacing w:before="0" w:after="0"/>
+              <w:spacing w:before="0" w:after="0" w:line="240"/>
               <w:jc w:val="center"/>
             </w:pPr>
             <w:r>
@@ -1303,7 +1359,7 @@
           </w:p>
           <w:p>
             <w:pPr>
-              <w:spacing w:before="0" w:after="0"/>
+              <w:spacing w:before="0" w:after="0" w:line="240"/>
               <w:jc w:val="center"/>
             </w:pPr>
             <w:r>
@@ -1317,7 +1373,35 @@
           </w:p>
           <w:p>
             <w:pPr>
-              <w:spacing w:before="0" w:after="0"/>
+              <w:spacing w:before="0" w:after="0" w:line="240"/>
+              <w:jc w:val="center"/>
+            </w:pPr>
+            <w:r>
+              <w:rPr>
+                <w:rFonts w:ascii="Arial" w:cs="Arial" w:eastAsia="Arial" w:hAnsi="Arial"/>
+                <w:sz w:val="20"/>
+                <w:szCs w:val="20"/>
+              </w:rPr>
+              <w:t xml:space="preserve"/>
+            </w:r>
+          </w:p>
+          <w:p>
+            <w:pPr>
+              <w:spacing w:before="0" w:after="0" w:line="240"/>
+              <w:jc w:val="center"/>
+            </w:pPr>
+            <w:r>
+              <w:rPr>
+                <w:rFonts w:ascii="Arial" w:cs="Arial" w:eastAsia="Arial" w:hAnsi="Arial"/>
+                <w:sz w:val="20"/>
+                <w:szCs w:val="20"/>
+              </w:rPr>
+              <w:t xml:space="preserve"/>
+            </w:r>
+          </w:p>
+          <w:p>
+            <w:pPr>
+              <w:spacing w:before="0" w:after="0" w:line="240"/>
               <w:jc w:val="center"/>
             </w:pPr>
             <w:r>
@@ -1334,7 +1418,7 @@
           </w:p>
           <w:p>
             <w:pPr>
-              <w:spacing w:before="0" w:after="0"/>
+              <w:spacing w:before="0" w:after="0" w:line="240"/>
               <w:jc w:val="center"/>
             </w:pPr>
             <w:r>
@@ -1351,7 +1435,7 @@
     </w:tbl>
     <w:sectPr>
       <w:pgSz w:w="11906" w:h="16838" w:orient="portrait"/>
-      <w:pgMar w:top="1134" w:right="1134" w:bottom="1134" w:left="1134" w:header="708" w:footer="708" w:gutter="0"/>
+      <w:pgMar w:top="567" w:right="850" w:bottom="567" w:left="850" w:header="708" w:footer="708" w:gutter="0"/>
       <w:pgNumType/>
       <w:docGrid w:linePitch="360"/>
     </w:sectPr>
@@ -1501,8 +1585,8 @@
     <w:rPrDefault>
       <w:rPr>
         <w:rFonts w:ascii="Arial" w:cs="Arial" w:eastAsia="Arial" w:hAnsi="Arial"/>
-        <w:sz w:val="20"/>
-        <w:szCs w:val="20"/>
+        <w:sz w:val="18"/>
+        <w:szCs w:val="18"/>
       </w:rPr>
     </w:rPrDefault>
     <w:pPrDefault/>

</xml_diff>